<commit_message>
Add rescinded contracts & recovery failure chapter — named cases
New Chapter 8B (IFMS article) + Ch.6C (eMB article):
- ~200 contracts rescinded statewide — ZERO systematic recovery monitoring
- Named Case 1: Bhairavji Bridge, Banswara — rescinded, nil recovery
- Named Case 2: Kotada Road, Udaipur — rescinded, nil recovery
- Named Case 3: Gannon Dunkerlay & Co — established firm, contract
  rescinded, substantial dues unrecovered, company walked free
- Broken incentive structure analysis: rescission = paper threat
- 4 mandatory reforms: centralised recovery register, legal priority,
  mandatory blacklisting, named-case CAG+ACB scrutiny
- New media demands: Recovery RTI + blacklist public register
- All 6 DOCX/PDF/PPTX exports regenerated with new chapter
- News.txt updated with full investigation text
</commit_message>
<xml_diff>
--- a/artifacts/rajasthan-ifms-crisis/IFMS-Rajasthan-Investigation.docx
+++ b/artifacts/rajasthan-ifms-crisis/IFMS-Rajasthan-Investigation.docx
@@ -958,6 +958,60 @@
           <w:color w:val="0D9488"/>
           <w:sz w:val="26"/>
         </w:rPr>
+        <w:t>Ch.8B  |  ~200 रद्द अनुबंध — वसूली शून्य: नामित ठेकेदार बेखौफ</w:t>
+      </w:r>
+    </w:p>
+    <w:p>
+      <w:pPr>
+        <w:ind w:left="227"/>
+      </w:pPr>
+      <w:r>
+        <w:rPr>
+          <w:b/>
+          <w:color w:val="1E3A5F"/>
+          <w:sz w:val="23"/>
+        </w:rPr>
+        <w:t>~200 Rescinded Contracts — Zero Recovery: Named Defaulters Walk Free</w:t>
+      </w:r>
+    </w:p>
+    <w:p>
+      <w:pPr>
+        <w:ind w:left="227"/>
+        <w:jc w:val="both"/>
+      </w:pPr>
+      <w:r>
+        <w:rPr>
+          <w:sz w:val="21"/>
+        </w:rPr>
+        <w:t>~200 contracts rescinded — Risk and Cost tenders floated — लेकिन recovery monitor नहीं होती। तीन नामित मामले: (1) भैरवजी Bridge, बाँसवाड़ा — rescinded, वसूली शून्य। (2) Kotada Road, उदयपुर — rescinded, differential cost unrecovered। (3) Gannon Dunkerlay — established company, contract rescinded, department entitlement unexercised, company walked free। Rescission एक कागज़ी खतरा बन गया — असली financial liability नहीं। ठेकेदार के लिए contract तोड़ने का कोई दाम नहीं।</w:t>
+      </w:r>
+    </w:p>
+    <w:p>
+      <w:pPr>
+        <w:ind w:left="227"/>
+        <w:jc w:val="both"/>
+      </w:pPr>
+      <w:r>
+        <w:rPr>
+          <w:i/>
+          <w:color w:val="44403C"/>
+          <w:sz w:val="20"/>
+        </w:rPr>
+        <w:t>Approximately 200 contracts have been rescinded for incomplete execution in Rajasthan PWD. Risk-and-cost tenders were invited. But there is no regular monitoring of recovery against defaulters. Three named examples: (1) Bhairavji Bridge, Banswara — rescinded, risk-and-cost tender floated, zero recovery from contractor. (2) Kotada Road, Udaipur — rescinded, differential cost unrecovered. (3) Gannon Dunkerlay &amp; Company — established firm, contract rescinded, substantial department entitlement unexercised, company walked free. Pattern: rescission is a paper threat, not a real financial liability. Mandatory reforms: centralised risk-and-cost recovery register in IFMS, mandatory blacklisting until full recovery, named-case CAG audit and ACB investigation.</w:t>
+      </w:r>
+    </w:p>
+    <w:p>
+      <w:r>
+        <w:t xml:space="preserve">· · · · · · · · · · · · · · · · · · · · · · · · · · · · · · · · · · · · · · · · </w:t>
+      </w:r>
+    </w:p>
+    <w:p>
+      <w:r>
+        <w:rPr>
+          <w:b/>
+          <w:color w:val="0D9488"/>
+          <w:sz w:val="26"/>
+        </w:rPr>
         <w:t>Ch.9  |  सात तत्काल माँगें</w:t>
       </w:r>
     </w:p>

</xml_diff>

<commit_message>
Add recovery portal & legal pursuit chapter — impunity architecture exposed
New Chapter 8C (IFMS) + 6D (eMB):
- Q1: Why no Digitised Recovery Portal in 15 years?
  Portal would make every non-recovery visible + attributable
  to a named officer — exactly what the system avoids
- Q2: Why no legal pursuit or monitoring?
  Two explanations: Gross Negligence OR Complicity
  (same officer who paid refuses to collect = ACB referral)
- Limitation Period ticking clock — cases may already be
  time-barred forever, officer accountability required
- 5-point Recovery Accountability Framework:
  A. Recovery Portal on IFMS — 90 day deadline
  B. Mandatory legal notice within 30 days of rescission
  C. Litigation Register — department legal cell, monthly
  D. Limitation Period automatic alerts
  E. Same-officer overlap = automatic ACB referral
- All 6 DOCX/PDF/PPTX exports regenerated
- News.txt updated with full investigation text
</commit_message>
<xml_diff>
--- a/artifacts/rajasthan-ifms-crisis/IFMS-Rajasthan-Investigation.docx
+++ b/artifacts/rajasthan-ifms-crisis/IFMS-Rajasthan-Investigation.docx
@@ -983,7 +983,7 @@
         <w:rPr>
           <w:sz w:val="21"/>
         </w:rPr>
-        <w:t>~200 contracts rescinded — Risk and Cost tenders floated — लेकिन recovery monitor नहीं होती। तीन नामित मामले: (1) भैरवजी Bridge, बाँसवाड़ा — rescinded, वसूली शून्य। (2) Kotada Road, उदयपुर — rescinded, differential cost unrecovered। (3) Gannon Dunkerlay — established company, contract rescinded, department entitlement unexercised, company walked free। Rescission एक कागज़ी खतरा बन गया — असली financial liability नहीं। ठेकेदार के लिए contract तोड़ने का कोई दाम नहीं।</w:t>
+        <w:t>~200 रद्द अनुबंध — Risk and Cost tenders — recovery monitoring शून्य। भैरवजी Bridge बाँसवाड़ा, Kotada Road उदयपुर, Gannon Dunkerlay — तीनों में वसूली शून्य। Rescission केवल कागज़ी खतरा। Blacklist enforce नहीं।</w:t>
       </w:r>
     </w:p>
     <w:p>
@@ -997,7 +997,61 @@
           <w:color w:val="44403C"/>
           <w:sz w:val="20"/>
         </w:rPr>
-        <w:t>Approximately 200 contracts have been rescinded for incomplete execution in Rajasthan PWD. Risk-and-cost tenders were invited. But there is no regular monitoring of recovery against defaulters. Three named examples: (1) Bhairavji Bridge, Banswara — rescinded, risk-and-cost tender floated, zero recovery from contractor. (2) Kotada Road, Udaipur — rescinded, differential cost unrecovered. (3) Gannon Dunkerlay &amp; Company — established firm, contract rescinded, substantial department entitlement unexercised, company walked free. Pattern: rescission is a paper threat, not a real financial liability. Mandatory reforms: centralised risk-and-cost recovery register in IFMS, mandatory blacklisting until full recovery, named-case CAG audit and ACB investigation.</w:t>
+        <w:t>Three named cases: Bhairavji Bridge Banswara (rescinded, nil recovery), Kotada Road Udaipur (rescinded, nil recovery), Gannon Dunkerlay &amp; Co (rescinded, substantial dues unexercised — company walked free). State-wide pattern: ~200 rescissions, zero systematic recovery monitoring. Rescission is a paper threat. No blacklist enforced. Taxpayer pays twice.</w:t>
+      </w:r>
+    </w:p>
+    <w:p>
+      <w:r>
+        <w:t xml:space="preserve">· · · · · · · · · · · · · · · · · · · · · · · · · · · · · · · · · · · · · · · · </w:t>
+      </w:r>
+    </w:p>
+    <w:p>
+      <w:r>
+        <w:rPr>
+          <w:b/>
+          <w:color w:val="0D9488"/>
+          <w:sz w:val="26"/>
+        </w:rPr>
+        <w:t>Ch.8C  |  Recovery Portal क्यों नहीं? Legal Pursuit क्यों नहीं? — Impunity का Architecture</w:t>
+      </w:r>
+    </w:p>
+    <w:p>
+      <w:pPr>
+        <w:ind w:left="227"/>
+      </w:pPr>
+      <w:r>
+        <w:rPr>
+          <w:b/>
+          <w:color w:val="1E3A5F"/>
+          <w:sz w:val="23"/>
+        </w:rPr>
+        <w:t>Why No Digitised Recovery Portal? Why No Legal Pursuit? — Architecture of Impunity</w:t>
+      </w:r>
+    </w:p>
+    <w:p>
+      <w:pPr>
+        <w:ind w:left="227"/>
+        <w:jc w:val="both"/>
+      </w:pPr>
+      <w:r>
+        <w:rPr>
+          <w:sz w:val="21"/>
+        </w:rPr>
+        <w:t>दो अनुत्तरित प्रश्न पूरे तंत्र को उघाड़ते हैं। प्रश्न 1: Digitised Recovery Portal क्यों नहीं? 15 वर्षों में नहीं बना — क्योंकि यह portal हर non-recovery को visible और attributable बना देता। प्रश्न 2: Legal pursuit और monitoring क्यों नहीं? Recovery करना department का legal obligation है। दो उत्तर: A) Gross Negligence — governance पतन। B) Complicity — जिस हाथ ने payments किए वही recovery रोक रहा है। पाँच-बिंदु framework: 90 दिन में Recovery Portal; 30 दिन में legal notice; Litigation Register; Limitation Period alerts; Same-officer overlap = automatic ACB referral।</w:t>
+      </w:r>
+    </w:p>
+    <w:p>
+      <w:pPr>
+        <w:ind w:left="227"/>
+        <w:jc w:val="both"/>
+      </w:pPr>
+      <w:r>
+        <w:rPr>
+          <w:i/>
+          <w:color w:val="44403C"/>
+          <w:sz w:val="20"/>
+        </w:rPr>
+        <w:t>Two unanswered questions expose the system. Q1: Why no Digitised Recovery Portal? Government has e-Procurement, IFMS, PayManager, NIC capacity. A portal could be built in 90 days on IFMS infrastructure — showing every rescinded contract, recoverable amount, officer responsible, legal notice status, limitation period alerts, and public access. It does not exist because it would make every non-recovery visible and attributable to a named officer. Q2: Why no legal pursuit or monitoring? Recovery is a legal obligation — not optional. Two explanations: A) Gross Negligence — management systems absent. B) Complicity — the same officer who processed and paid the contract refuses to initiate recovery. That overlap should be automatic ACB referral. Five-point framework: Recovery Portal in 90 days; mandatory legal notice in 30 days of rescission; litigation register monthly updated; limitation period automatic alerts; same-officer overlap triggers ACB referral.</w:t>
       </w:r>
     </w:p>
     <w:p>

</xml_diff>

<commit_message>
Clean full regeneration — all exports rewritten from scratch
- Deleted old generate_exports.py + regen_emb.py approach
- New print_all.py: single clean script, all 14 chapters in IFMS
  article + 13 chapters in eMB article fully regenerated
- Cache cleared before run
- All 6 files rebuilt: DOCX 39KB, PDF 12KB, PPTX 59KB (IFMS)
  and DOCX 38KB, PDF 9KB, PPTX 52KB (eMB)
- PPTX now has improved cover, facts grid, chapter slides with
  Hindi/English two-column layout, and updated CTA closing slide
  with impunity architecture quote
</commit_message>
<xml_diff>
--- a/artifacts/rajasthan-ifms-crisis/IFMS-Rajasthan-Investigation.docx
+++ b/artifacts/rajasthan-ifms-crisis/IFMS-Rajasthan-Investigation.docx
@@ -12,7 +12,7 @@
           <w:color w:val="1E3A5F"/>
           <w:sz w:val="44"/>
         </w:rPr>
-        <w:t>जन संवाददाता | JAN SAMVADDAATA</w:t>
+        <w:t>जन संवाददाता  |  JAN SAMVADDAATA</w:t>
       </w:r>
     </w:p>
     <w:p>
@@ -21,15 +21,16 @@
       </w:pPr>
       <w:r>
         <w:rPr>
+          <w:b w:val="0"/>
           <w:color w:val="0D9488"/>
           <w:sz w:val="18"/>
         </w:rPr>
-        <w:t>खोजी पत्रकारिता | Investigative Journalism  •  6 August 2026  •  PWD &amp; Irrigation Bureau, Rajasthan</w:t>
+        <w:t>खोजी पत्रकारिता  •  6 August 2026  •  PWD &amp; Irrigation Bureau, Rajasthan</w:t>
       </w:r>
     </w:p>
     <w:p>
       <w:r>
-        <w:t>────────────────────────────────────────────────────────────────────────────────</w:t>
+        <w:t>────────────────────────────────────────────────────────────────────────────</w:t>
       </w:r>
     </w:p>
     <w:p>
@@ -53,7 +54,7 @@
         <w:rPr>
           <w:b/>
           <w:color w:val="1E3A5F"/>
-          <w:sz w:val="28"/>
+          <w:sz w:val="26"/>
         </w:rPr>
         <w:t>Rajasthan's Digital Payment Crisis: The IFMS 3.0 Expose</w:t>
       </w:r>
@@ -66,22 +67,27 @@
         <w:rPr>
           <w:i/>
           <w:color w:val="6B6355"/>
-          <w:sz w:val="20"/>
+          <w:sz w:val="19"/>
         </w:rPr>
-        <w:t>WAM बंद, IFMS टूटा, Helpline मौन, Delegation गायब — एक सम्पूर्ण खोजी रिपोर्ट</w:t>
+        <w:t>WAM बंद · IFMS टूटा · Helpline मौन · Delegation गायब · DSC बाज़ार में · AS/FS देरी · HO Credential दलाली · 200 रद्द अनुबंध · Recovery Portal नहीं</w:t>
         <w:br/>
-        <w:t>WAM shutdown, IFMS broken, Helpline silent, No delegation — a complete investigative report</w:t>
+        <w:t>A complete investigative report on Rajasthan PWD &amp; Irrigation's digital governance collapse</w:t>
       </w:r>
     </w:p>
     <w:p>
       <w:r>
-        <w:t>────────────────────────────────────────────────────────────────────────────────</w:t>
+        <w:t>────────────────────────────────────────────────────────────────────────────</w:t>
       </w:r>
     </w:p>
     <w:p>
+      <w:pPr>
+        <w:jc w:val="center"/>
+      </w:pPr>
       <w:r>
         <w:rPr>
           <w:b/>
+          <w:color w:val="0D9488"/>
+          <w:sz w:val="20"/>
         </w:rPr>
         <w:t>AT A GLANCE — मुख्य तथ्य</w:t>
       </w:r>
@@ -120,7 +126,7 @@
             <w:r>
               <w:rPr>
                 <w:color w:val="CCCCCC"/>
-                <w:sz w:val="16"/>
+                <w:sz w:val="15"/>
               </w:rPr>
               <w:t>PWD Divisions affected</w:t>
             </w:r>
@@ -142,73 +148,15 @@
                 <w:color w:val="FFFFFF"/>
                 <w:sz w:val="28"/>
               </w:rPr>
-              <w:t>₹20L+</w:t>
+              <w:t>₹40Cr+</w:t>
               <w:br/>
             </w:r>
             <w:r>
               <w:rPr>
                 <w:color w:val="CCCCCC"/>
-                <w:sz w:val="16"/>
+                <w:sz w:val="15"/>
               </w:rPr>
-              <w:t>Outsourcing cost/Division/year</w:t>
-            </w:r>
-          </w:p>
-        </w:tc>
-        <w:tc>
-          <w:tcPr>
-            <w:tcW w:type="dxa" w:w="3135"/>
-            <w:shd w:val="clear" w:color="auto" w:fill="1E3A5F"/>
-          </w:tcPr>
-          <w:p>
-            <w:pPr>
-              <w:jc w:val="center"/>
-            </w:pPr>
-            <w:r/>
-            <w:r>
-              <w:rPr>
-                <w:b/>
-                <w:color w:val="FFFFFF"/>
-                <w:sz w:val="28"/>
-              </w:rPr>
-              <w:t>₹40 Cr+</w:t>
-              <w:br/>
-            </w:r>
-            <w:r>
-              <w:rPr>
-                <w:color w:val="CCCCCC"/>
-                <w:sz w:val="16"/>
-              </w:rPr>
-              <w:t>Annual state-level loss</w:t>
-            </w:r>
-          </w:p>
-        </w:tc>
-      </w:tr>
-      <w:tr>
-        <w:tc>
-          <w:tcPr>
-            <w:tcW w:type="dxa" w:w="3135"/>
-            <w:shd w:val="clear" w:color="auto" w:fill="1E3A5F"/>
-          </w:tcPr>
-          <w:p>
-            <w:pPr>
-              <w:jc w:val="center"/>
-            </w:pPr>
-            <w:r/>
-            <w:r>
-              <w:rPr>
-                <w:b/>
-                <w:color w:val="FFFFFF"/>
-                <w:sz w:val="28"/>
-              </w:rPr>
-              <w:t>14 Years</w:t>
-              <w:br/>
-            </w:r>
-            <w:r>
-              <w:rPr>
-                <w:color w:val="CCCCCC"/>
-                <w:sz w:val="16"/>
-              </w:rPr>
-              <w:t>WAM Portal worked (2012-2026)</w:t>
+              <w:t>Annual outsourcing loss statewide</w:t>
             </w:r>
           </w:p>
         </w:tc>
@@ -234,12 +182,14 @@
             <w:r>
               <w:rPr>
                 <w:color w:val="CCCCCC"/>
-                <w:sz w:val="16"/>
+                <w:sz w:val="15"/>
               </w:rPr>
-              <w:t>WAM shutdown, payments stopped</w:t>
+              <w:t>WAM shutdown — payments stopped 2026</w:t>
             </w:r>
           </w:p>
         </w:tc>
+      </w:tr>
+      <w:tr>
         <w:tc>
           <w:tcPr>
             <w:tcW w:type="dxa" w:w="3135"/>
@@ -262,9 +212,65 @@
             <w:r>
               <w:rPr>
                 <w:color w:val="CCCCCC"/>
-                <w:sz w:val="16"/>
+                <w:sz w:val="15"/>
               </w:rPr>
               <w:t>Documented in official complaint email</w:t>
+            </w:r>
+          </w:p>
+        </w:tc>
+        <w:tc>
+          <w:tcPr>
+            <w:tcW w:type="dxa" w:w="3135"/>
+            <w:shd w:val="clear" w:color="auto" w:fill="1E3A5F"/>
+          </w:tcPr>
+          <w:p>
+            <w:pPr>
+              <w:jc w:val="center"/>
+            </w:pPr>
+            <w:r/>
+            <w:r>
+              <w:rPr>
+                <w:b/>
+                <w:color w:val="FFFFFF"/>
+                <w:sz w:val="28"/>
+              </w:rPr>
+              <w:t>6 Mths</w:t>
+              <w:br/>
+            </w:r>
+            <w:r>
+              <w:rPr>
+                <w:color w:val="CCCCCC"/>
+                <w:sz w:val="15"/>
+              </w:rPr>
+              <w:t>AS-ID delay: Physical Oct 2025, IFMS Apr 2026</w:t>
+            </w:r>
+          </w:p>
+        </w:tc>
+        <w:tc>
+          <w:tcPr>
+            <w:tcW w:type="dxa" w:w="3135"/>
+            <w:shd w:val="clear" w:color="auto" w:fill="1E3A5F"/>
+          </w:tcPr>
+          <w:p>
+            <w:pPr>
+              <w:jc w:val="center"/>
+            </w:pPr>
+            <w:r/>
+            <w:r>
+              <w:rPr>
+                <w:b/>
+                <w:color w:val="FFFFFF"/>
+                <w:sz w:val="28"/>
+              </w:rPr>
+              <w:t>DSC</w:t>
+              <w:br/>
+            </w:r>
+            <w:r>
+              <w:rPr>
+                <w:color w:val="CCCCCC"/>
+                <w:sz w:val="15"/>
+              </w:rPr>
+              <w:t>At computer centre — IT Act 66C violation</w:t>
             </w:r>
           </w:p>
         </w:tc>
@@ -286,15 +292,15 @@
                 <w:color w:val="FFFFFF"/>
                 <w:sz w:val="28"/>
               </w:rPr>
-              <w:t>6 Months</w:t>
+              <w:t>~200</w:t>
               <w:br/>
             </w:r>
             <w:r>
               <w:rPr>
                 <w:color w:val="CCCCCC"/>
-                <w:sz w:val="16"/>
+                <w:sz w:val="15"/>
               </w:rPr>
-              <w:t>AS-ID delay: Physical Oct 2025, IFMS Apr 2026</w:t>
+              <w:t>Contracts rescinded — ZERO recovery monitoring</w:t>
             </w:r>
           </w:p>
         </w:tc>
@@ -320,9 +326,9 @@
             <w:r>
               <w:rPr>
                 <w:color w:val="CCCCCC"/>
-                <w:sz w:val="16"/>
+                <w:sz w:val="15"/>
               </w:rPr>
-              <w:t>Helpline/Email replies — Zero response</w:t>
+              <w:t>Helpline replies — employeehelpdesk.ifms@rajasthan.gov.in</w:t>
             </w:r>
           </w:p>
         </w:tc>
@@ -342,15 +348,15 @@
                 <w:color w:val="FFFFFF"/>
                 <w:sz w:val="28"/>
               </w:rPr>
-              <w:t>DSC</w:t>
+              <w:t>90 Days</w:t>
               <w:br/>
             </w:r>
             <w:r>
               <w:rPr>
                 <w:color w:val="CCCCCC"/>
-                <w:sz w:val="16"/>
+                <w:sz w:val="15"/>
               </w:rPr>
-              <w:t>At computer centre — IT Act 66C violation</w:t>
+              <w:t>Time to build Recovery Portal — never done in 15 yrs</w:t>
             </w:r>
           </w:p>
         </w:tc>
@@ -362,9 +368,9 @@
         <w:rPr>
           <w:b/>
           <w:color w:val="0D9488"/>
-          <w:sz w:val="26"/>
+          <w:sz w:val="25"/>
         </w:rPr>
-        <w:t>Ch.1  |  WAM Portal — नींव और वादा (2012)</w:t>
+        <w:t>────  Ch.1  |  WAM Portal — नींव और वादा (2012)</w:t>
       </w:r>
     </w:p>
     <w:p>
@@ -375,7 +381,7 @@
         <w:rPr>
           <w:b/>
           <w:color w:val="1E3A5F"/>
-          <w:sz w:val="23"/>
+          <w:sz w:val="22"/>
         </w:rPr>
         <w:t>WAM Portal — Foundation &amp; Promise (2012)</w:t>
       </w:r>
@@ -389,7 +395,7 @@
         <w:rPr>
           <w:sz w:val="21"/>
         </w:rPr>
-        <w:t>वर्ष 2012 में राजस्थान सरकार ने PWD और Irrigation के ठेकेदारों के लिए WAM portal लॉन्च किया। 14 वर्षों तक यह प्रणाली — खामियों के बावजूद — काम करती रही। 6 July 2026 तक सब संतोषजनक था।</w:t>
+        <w:t>2012 में WAM portal लॉन्च — PayManager integration। 14 वर्ष काम किया। आखिरी WAM payment: 6 July 2026।</w:t>
       </w:r>
     </w:p>
     <w:p>
@@ -403,12 +409,12 @@
           <w:color w:val="44403C"/>
           <w:sz w:val="20"/>
         </w:rPr>
-        <w:t>In 2012 Rajasthan launched wam.rajasthan.gov.in integrated with PayManager for direct contractor payments. For 14 years, despite flaws, the system functioned. Payments were processed. The last successful payment was 6 July 2026.</w:t>
+        <w:t>In 2012 Rajasthan launched WAM portal integrated with PayManager. For 14 years, despite flaws, payments processed. Last successful WAM payment: 6 July 2026.</w:t>
       </w:r>
     </w:p>
     <w:p>
       <w:r>
-        <w:t xml:space="preserve">· · · · · · · · · · · · · · · · · · · · · · · · · · · · · · · · · · · · · · · · </w:t>
+        <w:t xml:space="preserve">· · · · · · · · · · · · · · · · · · · · · · · · · · · · · · · · · · · · · · </w:t>
       </w:r>
     </w:p>
     <w:p>
@@ -416,9 +422,9 @@
         <w:rPr>
           <w:b/>
           <w:color w:val="0D9488"/>
-          <w:sz w:val="26"/>
+          <w:sz w:val="25"/>
         </w:rPr>
-        <w:t>Ch.2  |  WAM की छुपी खामियां — जो कभी नहीं सुधरीं</w:t>
+        <w:t>────  Ch.2  |  WAM की छुपी खामियां — जो कभी नहीं सुधरीं</w:t>
       </w:r>
     </w:p>
     <w:p>
@@ -429,7 +435,7 @@
         <w:rPr>
           <w:b/>
           <w:color w:val="1E3A5F"/>
-          <w:sz w:val="23"/>
+          <w:sz w:val="22"/>
         </w:rPr>
         <w:t>WAM's Hidden Flaws — Never Fixed</w:t>
       </w:r>
@@ -443,7 +449,7 @@
         <w:rPr>
           <w:sz w:val="21"/>
         </w:rPr>
-        <w:t>खामी 1: Bill केवल कागज़ पर — contractors कभी खुद bill नहीं बनाते थे। खामी 2: पारदर्शिता शून्य — नागरिकों के लिए कोई window नहीं। ये खामियां IFMS 3.0 में भी जारी हैं।</w:t>
+        <w:t>खामी 1: Bill केवल कागज़ पर। खामी 2: Transparency शून्य। दोनों खामियाँ IFMS 3.0 में भी जारी।</w:t>
       </w:r>
     </w:p>
     <w:p>
@@ -457,12 +463,12 @@
           <w:color w:val="44403C"/>
           <w:sz w:val="20"/>
         </w:rPr>
-        <w:t>Flaw 1: Bill Submission only on paper — contractors never self-submitted. Flaw 2: Zero public transparency — no citizen window for bill status or payment history. Both flaws carried into IFMS 2.0 and 3.0.</w:t>
+        <w:t>Flaw 1: Bill submission only on paper — contractors never self-submitted. Flaw 2: Zero public transparency — no citizen window. Both flaws carried unchanged into IFMS 3.0.</w:t>
       </w:r>
     </w:p>
     <w:p>
       <w:r>
-        <w:t xml:space="preserve">· · · · · · · · · · · · · · · · · · · · · · · · · · · · · · · · · · · · · · · · </w:t>
+        <w:t xml:space="preserve">· · · · · · · · · · · · · · · · · · · · · · · · · · · · · · · · · · · · · · </w:t>
       </w:r>
     </w:p>
     <w:p>
@@ -470,9 +476,9 @@
         <w:rPr>
           <w:b/>
           <w:color w:val="0D9488"/>
-          <w:sz w:val="26"/>
+          <w:sz w:val="25"/>
         </w:rPr>
-        <w:t>Ch.3  |  IFMS 2.0 — महत्वाकांक्षी सुधार, नई उलझनें</w:t>
+        <w:t>────  Ch.3  |  IFMS 2.0 — नई उलझनें (जनवरी 2025)</w:t>
       </w:r>
     </w:p>
     <w:p>
@@ -483,9 +489,9 @@
         <w:rPr>
           <w:b/>
           <w:color w:val="1E3A5F"/>
-          <w:sz w:val="23"/>
+          <w:sz w:val="22"/>
         </w:rPr>
-        <w:t>IFMS 2.0 — Ambitious Reform, New Entanglements (Jan 2025)</w:t>
+        <w:t>IFMS 2.0 — New Entanglements (Jan 2025)</w:t>
       </w:r>
     </w:p>
     <w:p>
@@ -497,7 +503,7 @@
         <w:rPr>
           <w:sz w:val="21"/>
         </w:rPr>
-        <w:t>जनवरी 2025 से 7 अनिवार्य IDs प्रति कार्य। तीन नई समस्याएं: Document overload, Electronic MB केवल कागज़ पर, Outsourcing विस्फोट — ₹20 लाख/Division/वर्ष, कुल नुकसान ₹40 करोड़+।</w:t>
+        <w:t>7 अनिवार्य IDs। तीन समस्याएं: Document overload, Electronic MB कागज़ पर, Outsourcing विस्फोट ₹40 Cr+ वार्षिक नुकसान।</w:t>
       </w:r>
     </w:p>
     <w:p>
@@ -511,12 +517,12 @@
           <w:color w:val="44403C"/>
           <w:sz w:val="20"/>
         </w:rPr>
-        <w:t>January 2025: 7 mandatory IDs per work (Work-ID, AS-ID, TS-ID, BOQ-ID, Package-ID, WO-ID, Abstract-ID). Electronic MB on mb.rajasthan.gov.in. Three new problems: Document overload, electronic MB remained on paper only, outsourcing explosion at ₹20L/Division/year totalling ₹40 Cr+ state-wide.</w:t>
+        <w:t>Jan 2025: 7 mandatory IDs per work. Three problems: Document overload, Electronic MB stayed on paper only, Outsourcing explosion ₹20L/Division/year = ₹40 Cr+ statewide annual loss.</w:t>
       </w:r>
     </w:p>
     <w:p>
       <w:r>
-        <w:t xml:space="preserve">· · · · · · · · · · · · · · · · · · · · · · · · · · · · · · · · · · · · · · · · </w:t>
+        <w:t xml:space="preserve">· · · · · · · · · · · · · · · · · · · · · · · · · · · · · · · · · · · · · · </w:t>
       </w:r>
     </w:p>
     <w:p>
@@ -524,9 +530,9 @@
         <w:rPr>
           <w:b/>
           <w:color w:val="0D9488"/>
-          <w:sz w:val="26"/>
+          <w:sz w:val="25"/>
         </w:rPr>
-        <w:t>Ch.4  |  IFMS 2.0 का अंधेरा पहलू — Scam और Accountability का पतन</w:t>
+        <w:t>────  Ch.4  |  IFMS 2.0 — Morphed Photo Scam, OTP दुरुपयोग</w:t>
       </w:r>
     </w:p>
     <w:p>
@@ -537,9 +543,9 @@
         <w:rPr>
           <w:b/>
           <w:color w:val="1E3A5F"/>
-          <w:sz w:val="23"/>
+          <w:sz w:val="22"/>
         </w:rPr>
-        <w:t>IFMS 2.0 Dark Side — Scam &amp; Accountability Collapse</w:t>
+        <w:t>IFMS 2.0 Dark Side — Morphed Photos, OTP Abuse</w:t>
       </w:r>
     </w:p>
     <w:p>
@@ -551,7 +557,7 @@
         <w:rPr>
           <w:sz w:val="21"/>
         </w:rPr>
-        <w:t>Morphed Photo Scam: झूठी progress photos portal पर। OTP दुरुपयोग: Divisional Accountants ने OTP operators को दिए। सरकारी accountability पूरी तरह बाहरी हाथों में।</w:t>
+        <w:t>Morphed photos as progress proof। Divisional Accountants ने OTP operators को दिए। सरकारी accountability outsource।</w:t>
       </w:r>
     </w:p>
     <w:p>
@@ -565,12 +571,12 @@
           <w:color w:val="44403C"/>
           <w:sz w:val="20"/>
         </w:rPr>
-        <w:t>Morphed Photo Scam: Digitally edited photos uploaded as progress evidence — work not done on ground. OTP Abuse: Divisional Accountants gave their OTPs to computer operators. Government accountability fully outsourced to unqualified private parties.</w:t>
+        <w:t>Morphed Photo Scam: Digitally edited photos uploaded as progress proof — work not done on ground. OTP Abuse: Divisional Accountants handed OTPs to computer operators. Government accountability fully outsourced.</w:t>
       </w:r>
     </w:p>
     <w:p>
       <w:r>
-        <w:t xml:space="preserve">· · · · · · · · · · · · · · · · · · · · · · · · · · · · · · · · · · · · · · · · </w:t>
+        <w:t xml:space="preserve">· · · · · · · · · · · · · · · · · · · · · · · · · · · · · · · · · · · · · · </w:t>
       </w:r>
     </w:p>
     <w:p>
@@ -578,9 +584,9 @@
         <w:rPr>
           <w:b/>
           <w:color w:val="0D9488"/>
-          <w:sz w:val="26"/>
+          <w:sz w:val="25"/>
         </w:rPr>
-        <w:t>Ch.4B  |  AS/FS ID देरी घोटाला और HO Credential दलाली</w:t>
+        <w:t>────  Ch.4B  |  AS/FS ID देरी घोटाला और HO Credential दलाली</w:t>
       </w:r>
     </w:p>
     <w:p>
@@ -591,7 +597,7 @@
         <w:rPr>
           <w:b/>
           <w:color w:val="1E3A5F"/>
-          <w:sz w:val="23"/>
+          <w:sz w:val="22"/>
         </w:rPr>
         <w:t>AS/FS ID Delay Scam &amp; Head Office Credential Bribery</w:t>
       </w:r>
@@ -605,7 +611,7 @@
         <w:rPr>
           <w:sz w:val="21"/>
         </w:rPr>
-        <w:t>Physical AS/FS: Oct 2025। Tender: Jan 2026। पहला bill: Apr 2026 — FS-ID absent। Division staff पहली बार Apr 2026 में AS-ID बनाता है — 6 माह देरी से। Contractor को 'secret bytes' मिलते हैं। HO में रिश्वत। Operator HO credentials से FS-ID generate करता है। IP Audit Trail सब उजागर कर सकता है।</w:t>
+        <w:t>Physical AS/FS Oct 2025 — IFMS ID April 2026: 6 माह देरी। FS-ID key to treasury payment। Contractor को secret bytes — HO में रिश्वत। Operator HO credentials से instant FS-ID। IP Audit trail सब उजागर कर सकता है।</w:t>
       </w:r>
     </w:p>
     <w:p>
@@ -619,12 +625,12 @@
           <w:color w:val="44403C"/>
           <w:sz w:val="20"/>
         </w:rPr>
-        <w:t>Physical AS/FS issued Oct 2025. Tender Jan 2026. Work Order Jan last week. First bill Apr 2026 — FS-ID absent. Division staff creates AS-ID in April — 6 months late. Contractor gets 'secret bytes', approaches HO. Certain operators hold HO officer login credentials and generate FS-ID instantly for bribe. IP Login Audit can expose this trail.</w:t>
+        <w:t>Physical AS/FS: Oct 2025. Tender: Jan 2026. Work Order: Jan last week. First bill attempt: Apr 2026 — FS-ID absent. AS-ID applied 6 months late. Contractor gets secret bytes, approaches HO. Certain operators hold HO login credentials and generate FS-ID for bribe. IP Login Audit can expose this trail.</w:t>
       </w:r>
     </w:p>
     <w:p>
       <w:r>
-        <w:t xml:space="preserve">· · · · · · · · · · · · · · · · · · · · · · · · · · · · · · · · · · · · · · · · </w:t>
+        <w:t xml:space="preserve">· · · · · · · · · · · · · · · · · · · · · · · · · · · · · · · · · · · · · · </w:t>
       </w:r>
     </w:p>
     <w:p>
@@ -632,9 +638,9 @@
         <w:rPr>
           <w:b/>
           <w:color w:val="0D9488"/>
-          <w:sz w:val="26"/>
+          <w:sz w:val="25"/>
         </w:rPr>
-        <w:t>Ch.5  |  वह काली जुलाई — WAM बंद, IFMS 3.0 तैयार नहीं</w:t>
+        <w:t>────  Ch.5  |  वह काली जुलाई — WAM बंद, IFMS 3.0 तैयार नहीं</w:t>
       </w:r>
     </w:p>
     <w:p>
@@ -645,7 +651,7 @@
         <w:rPr>
           <w:b/>
           <w:color w:val="1E3A5F"/>
-          <w:sz w:val="23"/>
+          <w:sz w:val="22"/>
         </w:rPr>
         <w:t>Black July — WAM Shutdown, IFMS 3.0 Not Ready</w:t>
       </w:r>
@@ -659,7 +665,7 @@
         <w:rPr>
           <w:sz w:val="21"/>
         </w:rPr>
-        <w:t>2 Jul: Training + IFMS 3.0 घोषणा। 6 Jul: WAM पर आखिरी payment। 10 Jul: WAM पूरी तरह बंद। 1 Aug: Portal टूटा — Vendor names गायब, Security deposits integrate नहीं, Bills ठप।</w:t>
+        <w:t>2 Jul: IFMS 3.0 घोषणा। 6 Jul: आखिरी WAM payment। 10 Jul: WAM बंद। 1 Aug: Portal टूटा — Vendors गायब, Security deposits नहीं, Bills ठप।</w:t>
       </w:r>
     </w:p>
     <w:p>
@@ -673,12 +679,12 @@
           <w:color w:val="44403C"/>
           <w:sz w:val="20"/>
         </w:rPr>
-        <w:t>2 Jul: Training given, IFMS 3.0 announced. 6 Jul: Last WAM payment. 10 Jul: WAM fully shut. 1 Aug: Portal still broken — vendor names missing, security deposits not integrated, bills completely stopped.</w:t>
+        <w:t>2 Jul: Training + IFMS 3.0 announced. 6 Jul: Last WAM payment. 10 Jul: WAM fully shutdown. 1 Aug 2026: Portal still broken — vendor names missing, security deposits not integrated, bills completely stopped.</w:t>
       </w:r>
     </w:p>
     <w:p>
       <w:r>
-        <w:t xml:space="preserve">· · · · · · · · · · · · · · · · · · · · · · · · · · · · · · · · · · · · · · · · </w:t>
+        <w:t xml:space="preserve">· · · · · · · · · · · · · · · · · · · · · · · · · · · · · · · · · · · · · · </w:t>
       </w:r>
     </w:p>
     <w:p>
@@ -686,9 +692,9 @@
         <w:rPr>
           <w:b/>
           <w:color w:val="0D9488"/>
-          <w:sz w:val="26"/>
+          <w:sz w:val="25"/>
         </w:rPr>
-        <w:t>Ch.6  |  IFMS 3.0 — कागज़ पर सुरक्षित, ज़मीन पर खोखली</w:t>
+        <w:t>────  Ch.6  |  IFMS 3.0 — कागज़ पर सुरक्षित, ज़मीन पर खोखली</w:t>
       </w:r>
     </w:p>
     <w:p>
@@ -699,7 +705,7 @@
         <w:rPr>
           <w:b/>
           <w:color w:val="1E3A5F"/>
-          <w:sz w:val="23"/>
+          <w:sz w:val="22"/>
         </w:rPr>
         <w:t>IFMS 3.0 — Secure on Paper, Hollow on Ground</w:t>
       </w:r>
@@ -713,7 +719,7 @@
         <w:rPr>
           <w:sz w:val="21"/>
         </w:rPr>
-        <w:t>सरकार का vision: Maker-Checker-Approver तीन-स्तरीय verification। ज़मीनी हकीकत: 90% XEN IFMS portal का inbox तक login नहीं कर पाते। एक operator तीनों roles निभाता है।</w:t>
+        <w:t>Vision: Maker-Checker-Approver। Reality: 90% XEN login नहीं कर पाते। एक operator तीनों roles। तीन-स्तरीय जाँच की आत्मा नष्ट।</w:t>
       </w:r>
     </w:p>
     <w:p>
@@ -727,12 +733,12 @@
           <w:color w:val="44403C"/>
           <w:sz w:val="20"/>
         </w:rPr>
-        <w:t>Government vision: Maker-Checker-Approver three-tier verification. Ground reality: 90% XEN cannot even login to IFMS portal inbox. Engineers handed OTPs to operators. One external operator performs Maker + Checker + Approver roles — three-tier verification soul destroyed.</w:t>
+        <w:t>Government vision: Maker-Checker-Approver three-tier verification. Ground reality: 90% XEN cannot login to IFMS inbox. OTPs given to operators. One external operator performs all three roles — the system's soul destroyed.</w:t>
       </w:r>
     </w:p>
     <w:p>
       <w:r>
-        <w:t xml:space="preserve">· · · · · · · · · · · · · · · · · · · · · · · · · · · · · · · · · · · · · · · · </w:t>
+        <w:t xml:space="preserve">· · · · · · · · · · · · · · · · · · · · · · · · · · · · · · · · · · · · · · </w:t>
       </w:r>
     </w:p>
     <w:p>
@@ -740,9 +746,9 @@
         <w:rPr>
           <w:b/>
           <w:color w:val="0D9488"/>
-          <w:sz w:val="26"/>
+          <w:sz w:val="25"/>
         </w:rPr>
-        <w:t>Ch.6A  |  आदर्श Maker-Checker-Approver Delegation Matrix</w:t>
+        <w:t>────  Ch.6A  |  आदर्श Delegation Matrix — सरकार ने Statutory Compulsion नहीं दी</w:t>
       </w:r>
     </w:p>
     <w:p>
@@ -753,9 +759,9 @@
         <w:rPr>
           <w:b/>
           <w:color w:val="1E3A5F"/>
-          <w:sz w:val="23"/>
+          <w:sz w:val="22"/>
         </w:rPr>
-        <w:t>Ideal Maker-Checker-Approver Delegation Matrix</w:t>
+        <w:t>Ideal Delegation Matrix — 10 Tasks, 3 Officers Each</w:t>
       </w:r>
     </w:p>
     <w:p>
@@ -767,7 +773,7 @@
         <w:rPr>
           <w:sz w:val="21"/>
         </w:rPr>
-        <w:t>तकनीकी विशेषज्ञ का प्रस्तावित framework: AS&amp;FS: AE/SDC→Div Auditor→XEN | Sanction: Div Auditor→Div Accountant→XEN | TS/BOQ/Package/WO/Abstract: AE→TA→XEN | Vendor Bill &amp; Refund: AE/SDC→Div Auditor→XEN। सरकार ने कोई Statutory Circular नहीं दिया — यही घातक चूक है।</w:t>
+        <w:t>10 tasks के लिए task-wise delegation: AS&amp;FS: AE/SDC→Div Auditor→XEN। Sanction: Div Auditor→Div Accountant→XEN। TS/BOQ/Package/WO/Abstract: AE→TA→XEN। सरकार ने कोई Statutory Circular नहीं दिया — यही घातक चूक।</w:t>
       </w:r>
     </w:p>
     <w:p>
@@ -781,12 +787,12 @@
           <w:color w:val="44403C"/>
           <w:sz w:val="20"/>
         </w:rPr>
-        <w:t>Technical expert proposed framework: AS&amp;FS: AE/Sub-Div Clerk→Div Auditor→XEN | Sanction: Div Auditor→Div Accountant→XEN | TS/BOQ/Package/WO/Abstract: AE→TA→XEN | Vendor Bill &amp; Refund: AE/Sub-Div Clerk→Div Auditor→XEN. Government has issued NO statutory circular mandating this delegation — fatal omission enabling one-operator monopoly.</w:t>
+        <w:t>Technical expert proposed framework: AS&amp;FS / Vendor Bill / Refund: AE/SDC → Div Auditor → XEN. Sanction: Div Auditor → Div Accountant → XEN. TS/BOQ/Package/WO/Abstract: AE → TA → XEN. Government issued NO statutory circular mandating this delegation — fatal omission enabling monopoly operator.</w:t>
       </w:r>
     </w:p>
     <w:p>
       <w:r>
-        <w:t xml:space="preserve">· · · · · · · · · · · · · · · · · · · · · · · · · · · · · · · · · · · · · · · · </w:t>
+        <w:t xml:space="preserve">· · · · · · · · · · · · · · · · · · · · · · · · · · · · · · · · · · · · · · </w:t>
       </w:r>
     </w:p>
     <w:p>
@@ -794,9 +800,9 @@
         <w:rPr>
           <w:b/>
           <w:color w:val="0D9488"/>
-          <w:sz w:val="26"/>
+          <w:sz w:val="25"/>
         </w:rPr>
-        <w:t>Ch.6B  |  Digital Signature का बाज़ार — XEN का DSC Computer Centre पर</w:t>
+        <w:t>────  Ch.6B  |  Digital Signature बाज़ार में — XEN का DSC Computer Centre पर</w:t>
       </w:r>
     </w:p>
     <w:p>
@@ -807,7 +813,7 @@
         <w:rPr>
           <w:b/>
           <w:color w:val="1E3A5F"/>
-          <w:sz w:val="23"/>
+          <w:sz w:val="22"/>
         </w:rPr>
         <w:t>Digital Signature Abuse — DSC at Market Computer Centres</w:t>
       </w:r>
@@ -821,7 +827,7 @@
         <w:rPr>
           <w:sz w:val="21"/>
         </w:rPr>
-        <w:t>किसी XEN ने IFMS login नहीं किया। DSC बाज़ार के computer centre पर। Operator XEN के DSC से Maker, Checker, Approver — तीनों roles निभाता है। IT Act 66C: किसी और की digital identity का उपयोग = 3 वर्ष कारावास।</w:t>
+        <w:t>कोई XEN login नहीं किया। DSC बाज़ार के computer centre पर। Operator XEN के DSC से तीनों roles। IT Act 66C: 3 वर्ष कारावास।</w:t>
       </w:r>
     </w:p>
     <w:p>
@@ -835,12 +841,12 @@
           <w:color w:val="44403C"/>
           <w:sz w:val="20"/>
         </w:rPr>
-        <w:t>No XEN has logged into IFMS. Their Digital Signature Certificates are kept at market computer centres. The operator uses the XEN's DSC to sign as Maker, Checker, AND Approver. IT Act 66C: using another person's digital identity = 3 years imprisonment. This crime is happening daily in government offices.</w:t>
+        <w:t>No XEN has logged into IFMS. Their DSC (Digital Signature Certificates) are kept at market computer centres. Operator signs as Maker, Checker AND Approver using XEN's DSC. IT Act 66C: using another person's digital identity = 3 years imprisonment. This crime occurs daily in government offices across Rajasthan.</w:t>
       </w:r>
     </w:p>
     <w:p>
       <w:r>
-        <w:t xml:space="preserve">· · · · · · · · · · · · · · · · · · · · · · · · · · · · · · · · · · · · · · · · </w:t>
+        <w:t xml:space="preserve">· · · · · · · · · · · · · · · · · · · · · · · · · · · · · · · · · · · · · · </w:t>
       </w:r>
     </w:p>
     <w:p>
@@ -848,9 +854,9 @@
         <w:rPr>
           <w:b/>
           <w:color w:val="0D9488"/>
-          <w:sz w:val="26"/>
+          <w:sz w:val="25"/>
         </w:rPr>
-        <w:t>Ch.7  |  1 August 2026 — Portal Status: 4 Documented Bugs</w:t>
+        <w:t>────  Ch.7  |  1 August 2026 — 4 Documented Bugs — Official Complaint Unanswered</w:t>
       </w:r>
     </w:p>
     <w:p>
@@ -861,7 +867,7 @@
         <w:rPr>
           <w:b/>
           <w:color w:val="1E3A5F"/>
-          <w:sz w:val="23"/>
+          <w:sz w:val="22"/>
         </w:rPr>
         <w:t>1 August 2026 — Portal Status: 4 Documented Bugs</w:t>
       </w:r>
@@ -875,7 +881,7 @@
         <w:rPr>
           <w:sz w:val="21"/>
         </w:rPr>
-        <w:t>Official complaint: employeehelpdesk.ifms@rajasthan.gov.in — कोई reply नहीं। Bug 1: Vendor list अधूरी। Bug 2: Security Refund balance absent। Bug 3: July Report non-responsive। Bug 4: Disbursement Engine page blank।</w:t>
+        <w:t>Complaint email: employeehelpdesk.ifms@rajasthan.gov.in — कोई reply नहीं। Bug 1: Vendor list अधूरी। Bug 2: Security Refund balance absent। Bug 3: July Report non-responsive। Bug 4: Disbursement Engine blank।</w:t>
       </w:r>
     </w:p>
     <w:p>
@@ -889,12 +895,12 @@
           <w:color w:val="44403C"/>
           <w:sz w:val="20"/>
         </w:rPr>
-        <w:t>Official complaint email to employeehelpdesk.ifms@rajasthan.gov.in — no reply. Bug #1: Vendor selection list incomplete, not alphabetical. Bug #2: Security Refund balance not showing. Bug #3: July Monthly Report non-responsive. Bug #4: Disbursement Engine WAM page blank.</w:t>
+        <w:t>Official complaint to employeehelpdesk.ifms@rajasthan.gov.in — no reply. Bug 1: Vendor selection list incomplete, not alphabetical. Bug 2: Security Refund balance not showing. Bug 3: July Monthly Report section non-responsive. Bug 4: Disbursement Engine WAM page completely blank.</w:t>
       </w:r>
     </w:p>
     <w:p>
       <w:r>
-        <w:t xml:space="preserve">· · · · · · · · · · · · · · · · · · · · · · · · · · · · · · · · · · · · · · · · </w:t>
+        <w:t xml:space="preserve">· · · · · · · · · · · · · · · · · · · · · · · · · · · · · · · · · · · · · · </w:t>
       </w:r>
     </w:p>
     <w:p>
@@ -902,9 +908,9 @@
         <w:rPr>
           <w:b/>
           <w:color w:val="0D9488"/>
-          <w:sz w:val="26"/>
+          <w:sz w:val="25"/>
         </w:rPr>
-        <w:t>Ch.8  |  IFMS Helpline: संपर्क नहीं, समाधान नहीं</w:t>
+        <w:t>────  Ch.8  |  IFMS Helpline — संपर्क नहीं, समाधान नहीं</w:t>
       </w:r>
     </w:p>
     <w:p>
@@ -915,9 +921,9 @@
         <w:rPr>
           <w:b/>
           <w:color w:val="1E3A5F"/>
-          <w:sz w:val="23"/>
+          <w:sz w:val="22"/>
         </w:rPr>
-        <w:t>IFMS Helpline: No Contact, No Solution</w:t>
+        <w:t>IFMS Helpline — No Contact, No Solution</w:t>
       </w:r>
     </w:p>
     <w:p>
@@ -929,7 +935,7 @@
         <w:rPr>
           <w:sz w:val="21"/>
         </w:rPr>
-        <w:t>सभी IFMS helpline numbers non-responsive। Email: employeehelpdesk.ifms@rajasthan.gov.in — silent। NIC support desk काम नहीं करता। कोई escalation matrix नहीं। Officers WhatsApp groups पर निर्भर।</w:t>
+        <w:t>Helpline numbers non-responsive। Email silent। NIC support ठप। Escalation matrix नहीं। Officers WhatsApp groups पर।</w:t>
       </w:r>
     </w:p>
     <w:p>
@@ -943,12 +949,12 @@
           <w:color w:val="44403C"/>
           <w:sz w:val="20"/>
         </w:rPr>
-        <w:t>All IFMS 3.0 helpline numbers non-responsive. Official email employeehelpdesk.ifms@rajasthan.gov.in silent. NIC support desk not functional. No escalation matrix. No dedicated 24x7 toll-free line. Officers resort to unofficial WhatsApp groups.</w:t>
+        <w:t>All helpline numbers non-responsive. Official email employeehelpdesk.ifms@rajasthan.gov.in silent — formal complaint with 4 bugs + screenshots sent, zero reply. NIC support desk non-functional. No escalation matrix. No dedicated 24x7 line. Officers resort to WhatsApp groups.</w:t>
       </w:r>
     </w:p>
     <w:p>
       <w:r>
-        <w:t xml:space="preserve">· · · · · · · · · · · · · · · · · · · · · · · · · · · · · · · · · · · · · · · · </w:t>
+        <w:t xml:space="preserve">· · · · · · · · · · · · · · · · · · · · · · · · · · · · · · · · · · · · · · </w:t>
       </w:r>
     </w:p>
     <w:p>
@@ -956,9 +962,9 @@
         <w:rPr>
           <w:b/>
           <w:color w:val="0D9488"/>
-          <w:sz w:val="26"/>
+          <w:sz w:val="25"/>
         </w:rPr>
-        <w:t>Ch.8B  |  ~200 रद्द अनुबंध — वसूली शून्य: नामित ठेकेदार बेखौफ</w:t>
+        <w:t>────  Ch.8B  |  ~200 रद्द अनुबंध — वसूली शून्य: नामित ठेकेदार बेखौफ</w:t>
       </w:r>
     </w:p>
     <w:p>
@@ -969,7 +975,7 @@
         <w:rPr>
           <w:b/>
           <w:color w:val="1E3A5F"/>
-          <w:sz w:val="23"/>
+          <w:sz w:val="22"/>
         </w:rPr>
         <w:t>~200 Rescinded Contracts — Zero Recovery: Named Defaulters Walk Free</w:t>
       </w:r>
@@ -983,7 +989,7 @@
         <w:rPr>
           <w:sz w:val="21"/>
         </w:rPr>
-        <w:t>~200 रद्द अनुबंध — Risk and Cost tenders — recovery monitoring शून्य। भैरवजी Bridge बाँसवाड़ा, Kotada Road उदयपुर, Gannon Dunkerlay — तीनों में वसूली शून्य। Rescission केवल कागज़ी खतरा। Blacklist enforce नहीं।</w:t>
+        <w:t>तीन नामित मामले: (1) भैरवजी Bridge, बाँसवाड़ा — rescinded, वसूली शून्य। (2) Kotada Road, उदयपुर — rescinded, cost unrecovered। (3) Gannon Dunkerlay — established company, walked free। ~200 rescissions — zero monitoring। Rescission = कागज़ी खतरा।</w:t>
       </w:r>
     </w:p>
     <w:p>
@@ -997,12 +1003,12 @@
           <w:color w:val="44403C"/>
           <w:sz w:val="20"/>
         </w:rPr>
-        <w:t>Three named cases: Bhairavji Bridge Banswara (rescinded, nil recovery), Kotada Road Udaipur (rescinded, nil recovery), Gannon Dunkerlay &amp; Co (rescinded, substantial dues unexercised — company walked free). State-wide pattern: ~200 rescissions, zero systematic recovery monitoring. Rescission is a paper threat. No blacklist enforced. Taxpayer pays twice.</w:t>
+        <w:t>Three named cases: (1) Bhairavji Bridge, Banswara — rescinded, risk-and-cost tender floated, ZERO recovery. (2) Kotada Road, Udaipur — rescinded, differential cost UNRECOVERED. (3) Gannon Dunkerlay &amp; Co — large established firm, contract rescinded, substantial dues UNEXERCISED, company walked free. Statewide pattern: ~200 rescissions, zero systematic recovery monitoring. Rescission is a paper threat, not a financial one.</w:t>
       </w:r>
     </w:p>
     <w:p>
       <w:r>
-        <w:t xml:space="preserve">· · · · · · · · · · · · · · · · · · · · · · · · · · · · · · · · · · · · · · · · </w:t>
+        <w:t xml:space="preserve">· · · · · · · · · · · · · · · · · · · · · · · · · · · · · · · · · · · · · · </w:t>
       </w:r>
     </w:p>
     <w:p>
@@ -1010,9 +1016,9 @@
         <w:rPr>
           <w:b/>
           <w:color w:val="0D9488"/>
-          <w:sz w:val="26"/>
+          <w:sz w:val="25"/>
         </w:rPr>
-        <w:t>Ch.8C  |  Recovery Portal क्यों नहीं? Legal Pursuit क्यों नहीं? — Impunity का Architecture</w:t>
+        <w:t>────  Ch.8C  |  Recovery Portal क्यों नहीं? Legal Pursuit क्यों नहीं? — Impunity का Architecture</w:t>
       </w:r>
     </w:p>
     <w:p>
@@ -1023,9 +1029,9 @@
         <w:rPr>
           <w:b/>
           <w:color w:val="1E3A5F"/>
-          <w:sz w:val="23"/>
+          <w:sz w:val="22"/>
         </w:rPr>
-        <w:t>Why No Digitised Recovery Portal? Why No Legal Pursuit? — Architecture of Impunity</w:t>
+        <w:t>Why No Recovery Portal? Why No Legal Pursuit? — Architecture of Impunity</w:t>
       </w:r>
     </w:p>
     <w:p>
@@ -1037,7 +1043,7 @@
         <w:rPr>
           <w:sz w:val="21"/>
         </w:rPr>
-        <w:t>दो अनुत्तरित प्रश्न पूरे तंत्र को उघाड़ते हैं। प्रश्न 1: Digitised Recovery Portal क्यों नहीं? 15 वर्षों में नहीं बना — क्योंकि यह portal हर non-recovery को visible और attributable बना देता। प्रश्न 2: Legal pursuit और monitoring क्यों नहीं? Recovery करना department का legal obligation है। दो उत्तर: A) Gross Negligence — governance पतन। B) Complicity — जिस हाथ ने payments किए वही recovery रोक रहा है। पाँच-बिंदु framework: 90 दिन में Recovery Portal; 30 दिन में legal notice; Litigation Register; Limitation Period alerts; Same-officer overlap = automatic ACB referral।</w:t>
+        <w:t>Q1: Recovery Portal 15 वर्षों में क्यों नहीं? क्योंकि visibility = accountability — जिससे system बचता है। Q2: Legal pursuit क्यों नहीं? Negligence या Complicity — जिस हाथ ने payments किए वही recovery रोक रहा है। Limitation periods expire हो रहे हैं। 5-point framework: Portal 90 days; Legal notice 30 days; Litigation register; Limitation alerts; Same-officer = ACB referral।</w:t>
       </w:r>
     </w:p>
     <w:p>
@@ -1051,12 +1057,12 @@
           <w:color w:val="44403C"/>
           <w:sz w:val="20"/>
         </w:rPr>
-        <w:t>Two unanswered questions expose the system. Q1: Why no Digitised Recovery Portal? Government has e-Procurement, IFMS, PayManager, NIC capacity. A portal could be built in 90 days on IFMS infrastructure — showing every rescinded contract, recoverable amount, officer responsible, legal notice status, limitation period alerts, and public access. It does not exist because it would make every non-recovery visible and attributable to a named officer. Q2: Why no legal pursuit or monitoring? Recovery is a legal obligation — not optional. Two explanations: A) Gross Negligence — management systems absent. B) Complicity — the same officer who processed and paid the contract refuses to initiate recovery. That overlap should be automatic ACB referral. Five-point framework: Recovery Portal in 90 days; mandatory legal notice in 30 days of rescission; litigation register monthly updated; limitation period automatic alerts; same-officer overlap triggers ACB referral.</w:t>
+        <w:t>Q1: Why no Digitised Recovery Portal despite 15 years of digital infrastructure? Because it would make every non-recovery visible and attributable to a named officer — exactly what the system avoids. Q2: Why no legal pursuit? Two explanations: Gross Negligence OR Complicity — the same officer who processed payments refuses to initiate recovery. Limitation periods are expiring unnoticed. Five-point framework: (A) Recovery Portal on IFMS in 90 days; (B) Legal notice within 30 days of rescission; (C) Litigation Register monthly updated; (D) Limitation period auto-alerts; (E) Same-officer overlap = automatic ACB referral.</w:t>
       </w:r>
     </w:p>
     <w:p>
       <w:r>
-        <w:t xml:space="preserve">· · · · · · · · · · · · · · · · · · · · · · · · · · · · · · · · · · · · · · · · </w:t>
+        <w:t xml:space="preserve">· · · · · · · · · · · · · · · · · · · · · · · · · · · · · · · · · · · · · · </w:t>
       </w:r>
     </w:p>
     <w:p>
@@ -1064,9 +1070,9 @@
         <w:rPr>
           <w:b/>
           <w:color w:val="0D9488"/>
-          <w:sz w:val="26"/>
+          <w:sz w:val="25"/>
         </w:rPr>
-        <w:t>Ch.9  |  सात तत्काल माँगें</w:t>
+        <w:t>────  Ch.9  |  सात तत्काल माँगें</w:t>
       </w:r>
     </w:p>
     <w:p>
@@ -1077,9 +1083,9 @@
         <w:rPr>
           <w:b/>
           <w:color w:val="1E3A5F"/>
-          <w:sz w:val="23"/>
+          <w:sz w:val="22"/>
         </w:rPr>
-        <w:t>Seven Immediate Demands</w:t>
+        <w:t>Seven Immediate Reforms</w:t>
       </w:r>
     </w:p>
     <w:p>
@@ -1091,7 +1097,7 @@
         <w:rPr>
           <w:sz w:val="21"/>
         </w:rPr>
-        <w:t>1. Statutory Delegation Order (Gazette Notification)। 2. नागरिक पारदर्शिता। 3. DSC अधिकारी के पास — operator के नहीं। 4. अनिवार्य Training। 5. Portal bugs deadline के साथ fix हों। 6. 24×7 Dedicated Helpline। 7. Independent Monitoring Committee।</w:t>
+        <w:t>1.Statutory Delegation Gazette Notification। 2.Citizen Transparency। 3.DSC अधिकारी के पास। 4.Mandatory Training। 5.Portal bugs deadline fix। 6.24×7 Helpline। 7.Independent Monitoring Committee।</w:t>
       </w:r>
     </w:p>
     <w:p>
@@ -1105,12 +1111,12 @@
           <w:color w:val="44403C"/>
           <w:sz w:val="20"/>
         </w:rPr>
-        <w:t>1. Statutory Delegation Order (Gazette Notification). 2. Citizen Transparency. 3. DSC must stay with officer — not at computer centre. 4. Mandatory comprehensive training. 5. Portal bugs fixed with deadline. 6. 24x7 dedicated helpline. 7. Independent Monitoring Committee.</w:t>
+        <w:t>1.Statutory Delegation Gazette Notification. 2.Citizen Transparency portal. 3.DSC with officer only — computer centre = IT Act offence. 4.Mandatory training before portal access. 5.Portal bugs fixed with deadline — NIC accountable. 6.24x7 dedicated helpline + working email. 7.Independent Monitoring Committee.</w:t>
       </w:r>
     </w:p>
     <w:p>
       <w:r>
-        <w:t xml:space="preserve">· · · · · · · · · · · · · · · · · · · · · · · · · · · · · · · · · · · · · · · · </w:t>
+        <w:t xml:space="preserve">· · · · · · · · · · · · · · · · · · · · · · · · · · · · · · · · · · · · · · </w:t>
       </w:r>
     </w:p>
     <w:p>
@@ -1118,9 +1124,9 @@
         <w:rPr>
           <w:b/>
           <w:color w:val="0D9488"/>
-          <w:sz w:val="26"/>
+          <w:sz w:val="25"/>
         </w:rPr>
-        <w:t>Ch.10  |  चौथे स्तंभ से आह्वान — 10 मीडिया माँगें</w:t>
+        <w:t>────  Ch.10  |  दस मीडिया माँगें — चौथे स्तंभ से आह्वान</w:t>
       </w:r>
     </w:p>
     <w:p>
@@ -1131,9 +1137,9 @@
         <w:rPr>
           <w:b/>
           <w:color w:val="1E3A5F"/>
-          <w:sz w:val="23"/>
+          <w:sz w:val="22"/>
         </w:rPr>
-        <w:t>Call to the Fourth Estate — 10 Media Demands</w:t>
+        <w:t>Ten Media Demands — Call to the Fourth Estate</w:t>
       </w:r>
     </w:p>
     <w:p>
@@ -1145,7 +1151,7 @@
         <w:rPr>
           <w:sz w:val="21"/>
         </w:rPr>
-        <w:t>1.Delegation RTI 2.AS/FS Backdating CAG Audit 3.IP Login Audit→ACB 4.XEN Login Sting 5.DSC Location Check 6.Live Helpline Test 7.Morphed Photo Expose 8.Public Audit माँग 9.One Operator Three Roles Expose 10.Public Monitoring अनिवार्य।</w:t>
+        <w:t>1.Delegation RTI। 2.AS/FS Backdating CAG Audit। 3.IP Login Audit→ACB। 4.XEN Login Sting। 5.DSC Location Check। 6.Live Helpline Test। 7.Morphed Photo Expose। 8.Public Audit। 9.One Operator Three Roles। 10.Recovery RTI।</w:t>
       </w:r>
     </w:p>
     <w:p>
@@ -1159,12 +1165,12 @@
           <w:color w:val="44403C"/>
           <w:sz w:val="20"/>
         </w:rPr>
-        <w:t>1.RTI on delegation circular 2.AS/FS backdating CAG audit 3.IP Login Audit→ACB 4.XEN Login sting 5.DSC location check 6.Live helpline call test 7.Morphed photo expose 8.Public audit demand 9.One operator three roles expose 10.Public monitoring mandate.</w:t>
+        <w:t>1.RTI on delegation circular. 2.AS/FS backdating CAG audit. 3.IP Login Audit → ACB. 4.XEN Login sting. 5.DSC location live check. 6.Helpline live call test. 7.Morphed photo expose. 8.IFMS public audit. 9.One operator three roles expose. 10.Rescinded contracts recovery RTI.</w:t>
       </w:r>
     </w:p>
     <w:p>
       <w:r>
-        <w:t xml:space="preserve">· · · · · · · · · · · · · · · · · · · · · · · · · · · · · · · · · · · · · · · · </w:t>
+        <w:t xml:space="preserve">· · · · · · · · · · · · · · · · · · · · · · · · · · · · · · · · · · · · · · </w:t>
       </w:r>
     </w:p>
     <w:p>
@@ -1174,9 +1180,9 @@
       <w:r>
         <w:rPr>
           <w:color w:val="0D9488"/>
-          <w:sz w:val="16"/>
+          <w:sz w:val="15"/>
         </w:rPr>
-        <w:t>जन संवाददाता  |  Published: 6 August 2026  |  All rights reserved  |  Public Interest Investigation</w:t>
+        <w:t>जन संवाददाता  |  6 August 2026  |  All rights reserved  |  Public Interest Investigation</w:t>
       </w:r>
     </w:p>
     <w:sectPr>

</xml_diff>